<commit_message>
feat: :sparkles: Add requirements
</commit_message>
<xml_diff>
--- a/reports/Student #5/05 - Requirements - Student #5.docx
+++ b/reports/Student #5/05 - Requirements - Student #5.docx
@@ -2150,6 +2150,14 @@
         </w:rPr>
         <w:t xml:space="preserve">       </w:t>
       </w:r>
+      <w:r>
+        <w:rPr>
+          <w:color w:val="000000"/>
+          <w:sz w:val="22"/>
+          <w:szCs w:val="22"/>
+        </w:rPr>
+        <w:t>X</w:t>
+      </w:r>
     </w:p>
     <w:p>
       <w:pPr>
@@ -2234,6 +2242,14 @@
         </w:rPr>
         <w:t xml:space="preserve">       </w:t>
       </w:r>
+      <w:r>
+        <w:rPr>
+          <w:color w:val="000000"/>
+          <w:sz w:val="22"/>
+          <w:szCs w:val="22"/>
+        </w:rPr>
+        <w:t>X</w:t>
+      </w:r>
     </w:p>
     <w:p>
       <w:pPr>
@@ -2295,6 +2311,14 @@
         </w:rPr>
         <w:t xml:space="preserve">       </w:t>
       </w:r>
+      <w:r>
+        <w:rPr>
+          <w:color w:val="000000"/>
+          <w:sz w:val="22"/>
+          <w:szCs w:val="22"/>
+        </w:rPr>
+        <w:t>X</w:t>
+      </w:r>
     </w:p>
     <w:p>
       <w:pPr>
@@ -2344,6 +2368,14 @@
           <w:szCs w:val="22"/>
         </w:rPr>
         <w:t xml:space="preserve">      </w:t>
+      </w:r>
+      <w:r>
+        <w:rPr>
+          <w:color w:val="000000"/>
+          <w:sz w:val="22"/>
+          <w:szCs w:val="22"/>
+        </w:rPr>
+        <w:t>X</w:t>
       </w:r>
     </w:p>
     <w:p/>

</xml_diff>